<commit_message>
Update 9 mar 2026
</commit_message>
<xml_diff>
--- a/uprojects/Oleksii/Biophoton/Changes01.docx
+++ b/uprojects/Oleksii/Biophoton/Changes01.docx
@@ -4,8 +4,13 @@
   <w:body>
     <w:p/>
     <w:p>
+      <w:proofErr w:type="spellStart"/>
       <w:r>
-        <w:t>Summery of the last discussion.</w:t>
+        <w:t>Summery</w:t>
+      </w:r>
+      <w:proofErr w:type="spellEnd"/>
+      <w:r>
+        <w:t xml:space="preserve"> of the last discussion.</w:t>
       </w:r>
     </w:p>
     <w:p/>
@@ -19,6 +24,9 @@
       <w:r>
         <w:t>move J16 to middle</w:t>
       </w:r>
+      <w:r>
+        <w:t xml:space="preserve"> position.</w:t>
+      </w:r>
     </w:p>
     <w:p>
       <w:pPr>
@@ -30,6 +38,9 @@
       <w:r>
         <w:t>Add 0 res on Y0 and Y0 on both mux. 1 capacitor</w:t>
       </w:r>
+      <w:r>
+        <w:t xml:space="preserve"> C1</w:t>
+      </w:r>
     </w:p>
     <w:p>
       <w:pPr>
@@ -38,6 +49,9 @@
           <w:numId w:val="2"/>
         </w:numPr>
       </w:pPr>
+      <w:r>
+        <w:t xml:space="preserve">C1 </w:t>
+      </w:r>
       <w:r>
         <w:t>10nF between Y0's</w:t>
       </w:r>
@@ -127,8 +141,13 @@
         </w:numPr>
       </w:pPr>
       <w:r>
-        <w:t>Connect MOSI through Adum</w:t>
+        <w:t xml:space="preserve">Connect MOSI through </w:t>
       </w:r>
+      <w:proofErr w:type="spellStart"/>
+      <w:r>
+        <w:t>Adum</w:t>
+      </w:r>
+      <w:proofErr w:type="spellEnd"/>
     </w:p>
     <w:p/>
     <w:sectPr>
@@ -1053,6 +1072,7 @@
   <w:style w:type="character" w:default="1" w:styleId="DefaultParagraphFont">
     <w:name w:val="Default Paragraph Font"/>
     <w:uiPriority w:val="1"/>
+    <w:semiHidden/>
     <w:unhideWhenUsed/>
   </w:style>
   <w:style w:type="table" w:default="1" w:styleId="TableNormal">

</xml_diff>